<commit_message>
Update student details to Chetan Kharade (PRN: 2125UCSM1012)
</commit_message>
<xml_diff>
--- a/NPC_Unit4_DHCP_Assignment_Report.docx
+++ b/NPC_Unit4_DHCP_Assignment_Report.docx
@@ -53,7 +53,7 @@
           </w:tcPr>
           <w:p>
             <w:r>
-              <w:t>Shubham Shinde</w:t>
+              <w:t>Chetan Kharade</w:t>
             </w:r>
           </w:p>
         </w:tc>
@@ -78,7 +78,7 @@
           </w:tcPr>
           <w:p>
             <w:r>
-              <w:t>2125UCSM1042</w:t>
+              <w:t>2125UCSM1012</w:t>
             </w:r>
           </w:p>
         </w:tc>
@@ -178,7 +178,7 @@
           </w:tcPr>
           <w:p>
             <w:r>
-              <w:t>Configure-DHCP-and-Set-Up-a-Network-Using-Cisco-Packet-Tracer</w:t>
+              <w:t>unit-4</w:t>
             </w:r>
           </w:p>
         </w:tc>
@@ -203,7 +203,7 @@
           </w:tcPr>
           <w:p>
             <w:r>
-              <w:t>https://github.com/ShubhamShinde148/Configure-DHCP-and-Set-Up-a-Network-Using-Cisco-Packet-Tracer</w:t>
+              <w:t>https://github.com/chetan475/unit-4</w:t>
             </w:r>
           </w:p>
         </w:tc>
@@ -835,7 +835,7 @@
           <w:color w:val="0066CC"/>
           <w:u w:val="single"/>
         </w:rPr>
-        <w:t>✓ GitHub Repository: https://github.com/ShubhamShinde148/Configure-DHCP-and-Set-Up-a-Network-Using-Cisco-Packet-Tracer</w:t>
+        <w:t>✓ GitHub Repository: https://github.com/chetan475/unit-4</w:t>
       </w:r>
     </w:p>
     <w:sectPr>

</xml_diff>